<commit_message>
Remove 'Copy to' list from IAP meeting notices
Co-Authored-By: Claude Opus 5.5 <noreply@anthropic.com>
Claude-Session: https://claude.ai/code/session_01ELaQ6vS1YNg97XUU7RUmR3
</commit_message>
<xml_diff>
--- a/All Annexure Citeria 10/10.1/Meeting-notices/IAP_Meeting_Notice_01_2023_25th_March_2023.docx
+++ b/All Annexure Citeria 10/10.1/Meeting-notices/IAP_Meeting_Notice_01_2023_25th_March_2023.docx
@@ -375,7 +375,7 @@
     </w:p>
     <w:p>
       <w:pPr>
-        <w:spacing w:after="0" w:before="320"/>
+        <w:spacing w:after="0" w:before="800"/>
       </w:pPr>
     </w:p>
     <w:p>
@@ -446,59 +446,6 @@
           <w:u w:val="none"/>
         </w:rPr>
         <w:t>Daffodil International University</w:t>
-      </w:r>
-    </w:p>
-    <w:p>
-      <w:pPr>
-        <w:spacing w:after="40" w:before="200"/>
-      </w:pPr>
-      <w:r>
-        <w:rPr>
-          <w:b/>
-        </w:rPr>
-        <w:t>Copy to:</w:t>
-      </w:r>
-    </w:p>
-    <w:p>
-      <w:pPr>
-        <w:spacing w:after="0" w:before="0"/>
-        <w:ind w:left="340"/>
-      </w:pPr>
-      <w:r>
-        <w:rPr>
-          <w:b w:val="0"/>
-          <w:sz w:val="22"/>
-          <w:u w:val="none"/>
-        </w:rPr>
-        <w:t>•  Dean, Faculty of Engineering</w:t>
-      </w:r>
-    </w:p>
-    <w:p>
-      <w:pPr>
-        <w:spacing w:after="0" w:before="0"/>
-        <w:ind w:left="340"/>
-      </w:pPr>
-      <w:r>
-        <w:rPr>
-          <w:b w:val="0"/>
-          <w:sz w:val="22"/>
-          <w:u w:val="none"/>
-        </w:rPr>
-        <w:t>•  All members of the Industrial Advisory Panel (by e-mail)</w:t>
-      </w:r>
-    </w:p>
-    <w:p>
-      <w:pPr>
-        <w:spacing w:after="0" w:before="0"/>
-        <w:ind w:left="340"/>
-      </w:pPr>
-      <w:r>
-        <w:rPr>
-          <w:b w:val="0"/>
-          <w:sz w:val="22"/>
-          <w:u w:val="none"/>
-        </w:rPr>
-        <w:t>•  Office copy</w:t>
       </w:r>
     </w:p>
     <w:sectPr>

</xml_diff>